<commit_message>
Python Notebook for HF-explore
</commit_message>
<xml_diff>
--- a/hf-explore/Activity-12-Hugging-Face.docx
+++ b/hf-explore/Activity-12-Hugging-Face.docx
@@ -12,7 +12,7 @@
     </w:p>
     <w:p>
       <w:r>
-        <w:t>AI Driven App Development  ·  2026 Fall</w:t>
+        <w:t>AI Driven App Development, 2026 Fall</w:t>
       </w:r>
     </w:p>
     <w:p>
@@ -22,7 +22,7 @@
     </w:p>
     <w:p>
       <w:r>
-        <w:t>Our app is a simple lead qualifier. A person pastes an inbound note. A small Hub model pulls out the person and the company so we can match the note to an account. Deciding whether the lead is actually qualified, and any open-ended reply, stays with a person or with Gemini.</w:t>
+        <w:t>Our app is a simple lead qualifier. Someone pastes an inbound note, a small Hub model pulls out the person and the company, and we match the note to an account. Whether the lead is actually qualified, and any open-ended reply, still goes to a person or to Gemini.</w:t>
       </w:r>
     </w:p>
     <w:p>
@@ -51,7 +51,7 @@
     </w:p>
     <w:p>
       <w:r>
-        <w:t>Models is the catalog of pretrained weights, plus the tokenizer, model card, and license that go with them. A developer cares because this is where you check what a model was trained to do, whether it is small enough to run, and whether the license allows the product you are building.</w:t>
+        <w:t>Models is the catalog of pretrained weights, along with the tokenizer, model card, and license. You go there to see what a model was trained to do, whether it will fit on a laptop, and whether the license lets you use it.</w:t>
       </w:r>
     </w:p>
     <w:p>
@@ -64,7 +64,7 @@
     </w:p>
     <w:p>
       <w:r>
-        <w:t>Datasets is shared training and evaluation data, with a card that says where the data came from and how it is split. A developer cares because the data is what the model actually learned, and a dataset license can block a use even when the model license looks open.</w:t>
+        <w:t>Datasets is shared training and evaluation data, with a card that says where the data came from and how it is split. That data is what the model actually learned, and the dataset license can block a use even when the model license looks open.</w:t>
       </w:r>
     </w:p>
     <w:p>
@@ -77,7 +77,7 @@
     </w:p>
     <w:p>
       <w:r>
-        <w:t>Spaces are hosted apps, usually Gradio or Streamlit, that run a model in the browser on Hugging Face hardware. A developer cares because you can try a model before downloading it, or put a demo up without running your own server.</w:t>
+        <w:t>Spaces are hosted apps, usually Gradio or Streamlit, that run a model in the browser on Hugging Face's own hardware. You can try a model there before you download it, or put up a demo without running your own server.</w:t>
       </w:r>
     </w:p>
     <w:p>
@@ -90,7 +90,7 @@
     </w:p>
     <w:p>
       <w:r>
-        <w:t>Docs is the documentation for the Hub and the libraries, including transformers and pipeline(). A developer cares because that is where the task names, the loading code, and the limits of a model are written down.</w:t>
+        <w:t>Docs is the documentation for the Hub and the libraries, including transformers and pipeline(). The task names, the loading code, and what a model will not do are written there.</w:t>
       </w:r>
     </w:p>
     <w:p>
@@ -108,7 +108,7 @@
     </w:p>
     <w:p>
       <w:r>
-        <w:t>The model card describes bge-small-en-v1.5 as an English embedding model that turns text into vectors for retrieval, and says version 1.5 has a more reasonable similarity distribution.</w:t>
+        <w:t>The card says bge-small-en-v1.5 is an English embedding model that turns text into vectors for retrieval, and that version 1.5 has a more reasonable similarity distribution.</w:t>
       </w:r>
     </w:p>
     <w:p>
@@ -129,22 +129,22 @@
     </w:p>
     <w:p>
       <w:r>
-        <w:t>GPL duties start when you distribute the software. The three cases are different because only the last one hands the program to someone else.</w:t>
+        <w:t>GPL duties start when you distribute the software. Only the last case hands the program to someone else.</w:t>
       </w:r>
     </w:p>
     <w:p>
       <w:r>
-        <w:t>Internal analysis only. Running the model on our own machines, for our own analysis, is not distribution. We could use it that way without publishing our analysis code.</w:t>
+        <w:t>Internal analysis only. We would run it on our own machines for our own analysis, so we would not have to publish our analysis code.</w:t>
       </w:r>
     </w:p>
     <w:p>
       <w:r>
-        <w:t>Behind our web app, users only see results. Showing a score or a label over the network is not the same as giving someone the program. GPL 3.0 does not treat that as distribution. The Affero GPL was written to close that gap, and this model is GPL, not AGPL. We could keep the app source private. We should still not ship a copy of the weights to the customer.</w:t>
+        <w:t>Behind our web app, users only see results. They would get a score or a label, which is not a copy of the program, and GPL 3.0 does not count that as distribution. AGPL was written for the network case. This model is GPL, so we could keep the app source private. We still should not give the customer a copy of the weights.</w:t>
       </w:r>
     </w:p>
     <w:p>
       <w:r>
-        <w:t>Packaged inside software we sell or give to customers. That is distribution. GPL 3.0 is copyleft, so the program we hand over has to be under GPL 3.0, and the people who receive it have to be able to get the source. We can charge money. Those customers can pass the software on, and we cannot keep that product closed.</w:t>
+        <w:t>Packaged inside software we sell or give to customers. That is distribution. GPL 3.0 is copyleft, so the program we hand over has to stay under GPL 3.0, and the people who receive it have to be able to get the source. We can charge for it. Those customers can pass the software on, so the product cannot stay closed.</w:t>
       </w:r>
     </w:p>
     <w:p>
@@ -170,7 +170,7 @@
     </w:p>
     <w:p>
       <w:r>
-        <w:t>Yes. Apache 2.0 is one of the common permissive licenses: we can use, change, and ship the model inside our own app without open-sourcing that app. What it restricts is mostly notice-keeping: we have to retain the copyright and license notices, and it comes with no warranty.</w:t>
+        <w:t>Yes, Apache 2.0 is one of the common permissive licenses, so we can use, change, and ship the model inside our own app without releasing that app's source. We do have to keep the copyright and license notices, and there is no warranty.</w:t>
       </w:r>
     </w:p>
     <w:p>
@@ -216,7 +216,7 @@
     </w:p>
     <w:p>
       <w:r>
-        <w:t>Feature: when an inbound note arrives, pull out the person and the company so we can match the lead to an account before anyone decides if it is qualified.</w:t>
+        <w:t>Feature: an inbound note comes in, and the model pulls out the person and the company so we can match the lead to an account before anyone decides if it is qualified.</w:t>
       </w:r>
     </w:p>
     <w:p>
@@ -229,17 +229,12 @@
     </w:p>
     <w:p>
       <w:r>
-        <w:t>On the model card, the panel on the right is Hugging Face’s own widget. It offers one text box and a Generate button, and no choices for which entity types to return. I was logged out. After I entered “Maya Chen from Northwind Logistics asked for a demo of our lead scoring tool.” and clicked Generate, the panel said: “Please login with your Hugging Face account to run the widgets.” The card did not return any entities.</w:t>
+        <w:t>The panel on the right of the model card is Hugging Face's own widget. It has one text box and a Generate button, and no way to pick which entity types come back. I was logged out. I typed "Maya Chen from Northwind Logistics asked for a demo of our lead scoring tool." and hit Generate. The panel said "Please login with your Hugging Face account to run the widgets." No entities came back.</w:t>
       </w:r>
     </w:p>
     <w:p>
       <w:r>
-        <w:t>The Space I tried is ashish-soni08/Named-Entity-Recognition, a Gradio app that user built, not the model author and not Hugging Face. It has a text box, Clear, Submit, and two example sentences (“My name is Andrew…” and “My name is Poli…”). The page was already awake. The same Northwind note came back in a couple of seconds, with Maya Chen highlighted as B-PER and Northwind Logistics highlighted as B-ORG, inside the original sentence. It worked. It does not show a confidence score, and it leaves the labels as raw beginning-of-entity tags.</w:t>
-      </w:r>
-    </w:p>
-    <w:p>
-      <w:r>
-        <w:t>So the card widget is Hugging Face’s, and it did not run without a login. The Space is a third-party Gradio app: more inputs (examples, clear, submit), a highlighted sentence instead of a score, and it worked in a couple of seconds.</w:t>
+        <w:t>The Space I tried is ashish-soni08/Named-Entity-Recognition. ashish-soni08 built it in Gradio. It is not from the model author or from Hugging Face. It has a text box, Clear, Submit, and two example sentences ("My name is Andrew..." and "My name is Poli..."). The page was already awake. I put in the same Northwind note and got a result in a couple of seconds: Maya Chen highlighted as B-PER and Northwind Logistics highlighted as B-ORG, in the original sentence. It worked. There is no confidence score, and the labels stay as raw beginning-of-entity tags.</w:t>
       </w:r>
     </w:p>
     <w:p>
@@ -252,17 +247,17 @@
     </w:p>
     <w:p>
       <w:r>
-        <w:t>A free Space goes to sleep when nobody is using it. The next visitor waits while the container starts and the model loads, which feels like the page is hung.</w:t>
+        <w:t>Free Spaces go to sleep when nobody is using them. The next person waits while the container starts and the model loads, and it feels like the page is hung.</w:t>
       </w:r>
     </w:p>
     <w:p>
       <w:r>
-        <w:t>The free machine is a small shared CPU. A model that is quick on a laptop can crawl there, or sit in a queue behind other people using the same Space.</w:t>
+        <w:t>The free machine is a small shared CPU. Something that is quick on a laptop can crawl there, or wait in a queue behind other people on the same Space.</w:t>
       </w:r>
     </w:p>
     <w:p>
       <w:r>
-        <w:t>The Space is a separate app from the model. If the owner hits the free-tier quota, a dependency breaks, or the model file moves, the Space pauses or errors on startup even though the model card is still fine.</w:t>
+        <w:t>A Space is its own app, separate from the model. If the owner hits the free-tier quota, a dependency breaks, or the model file moves, the Space pauses or errors on startup. The model card can still look fine.</w:t>
       </w:r>
     </w:p>
     <w:p>
@@ -322,7 +317,7 @@
     </w:p>
     <w:p>
       <w:r>
-        <w:t>The project is hf-explore inside the OIM3641_F26 repo. Python is pinned to 3.12 in .python-version. transformers and torch are installed. streamlit was added in Part 5 with uv add streamlit.</w:t>
+        <w:t>The project is the hf-explore folder in the OIM3641_F26 repo. Python is pinned to 3.12 in .python-version. transformers and torch are installed. I added streamlit in Part 5 with uv add streamlit.</w:t>
       </w:r>
     </w:p>
     <w:p>
@@ -1117,7 +1112,7 @@
     </w:p>
     <w:p>
       <w:r>
-        <w:t>Transformers also printed a load report. bert.pooler.dense.weight and bert.pooler.dense.bias were UNEXPECTED. That checkpoint carries pooler weights this token-classification head does not use. The report says they can be ignored.</w:t>
+        <w:t>Transformers also printed a load report. bert.pooler.dense.weight and bert.pooler.dense.bias came back UNEXPECTED. The checkpoint still has those pooler weights, and this token-classification head does not use them. The report says they can be ignored.</w:t>
       </w:r>
     </w:p>
     <w:p>
@@ -1330,7 +1325,7 @@
     </w:p>
     <w:p>
       <w:r>
-        <w:t>The first run took 31.3 seconds because it downloaded and loaded the weights; the second took 2.1 seconds because those files were already cached. Locally the model returned the same person and company the Space highlighted, plus a confidence score and the full name as one span instead of a B-PER tag. The model card widget never returned a result, because it asked me to log in.</w:t>
+        <w:t>The first run took 31.3 seconds because it downloaded and loaded the weights, and the second took 2.1 seconds because those files were already cached. Locally I got the same person and company the Space highlighted, plus a confidence score, and the full name came back as one span instead of a B-PER tag. The model card widget never returned a result because it asked me to log in.</w:t>
       </w:r>
     </w:p>
     <w:p>
@@ -1351,12 +1346,12 @@
     </w:p>
     <w:p>
       <w:r>
-        <w:t>Added with uv add streamlit. Run with uv run streamlit run app.py.</w:t>
+        <w:t>I added it with uv add streamlit. Run it with uv run streamlit run app.py.</w:t>
       </w:r>
     </w:p>
     <w:p>
       <w:r>
-        <w:t>load_ner() is decorated with @st.cache_resource, so the pipeline loads once. The note comes in through st.text_input. The screen shows Person and Company with a confidence percent, not the raw list of dictionaries.</w:t>
+        <w:t>load_ner() has @st.cache_resource on it, so the pipeline loads once. The note comes in through st.text_input. The page lists Person and Company with a confidence percent. It does not print the raw list of dictionaries.</w:t>
       </w:r>
     </w:p>
     <w:p>
@@ -1369,7 +1364,7 @@
     </w:p>
     <w:p>
       <w:r>
-        <w:t>An empty note never calls the model. Extract on a blank box shows st.error: “Paste a note first. An empty message has nothing to extract.” The model call is also wrapped in try/except, and a failure is shown with st.error.</w:t>
+        <w:t>If the note is empty, the app does not call the model. Extract on a blank box shows st.error with "Paste a note first. An empty message has nothing to extract." The model call is also in try/except, and a failure shows up with st.error.</w:t>
       </w:r>
     </w:p>
     <w:p>
@@ -1382,7 +1377,7 @@
     </w:p>
     <w:p>
       <w:r>
-        <w:t>Input: “Sarah Okonkwo at Brightline Capital asked for pricing on a 50-seat plan.”</w:t>
+        <w:t>Input: "Sarah Okonkwo at Brightline Capital asked for pricing on a 50-seat plan."</w:t>
       </w:r>
     </w:p>
     <w:p>
@@ -2388,7 +2383,7 @@
     </w:p>
     <w:p>
       <w:r>
-        <w:t>Upload this Word document to Canvas. It has the answers, main.py and its output, app.py, and the screenshot.</w:t>
+        <w:t>Upload this Word document to Canvas. It includes the answers, the main.py code and output, app.py, and the screenshot.</w:t>
       </w:r>
     </w:p>
     <w:sectPr>

</xml_diff>